<commit_message>
Questionnaire de paramétrage AxisPro, mise en page commune avec celui de la finance
25 questions pour la direction et les consultants de MB AxisPro : grille et méthode
(seuils, pondération, validité des pièces), dossiers en cours, comités, modèle
financier, portail, temps et honoraires, autres activités du cabinet, utilisateurs.
Mise en page partagée (questionnaire_commun.py) ; « MB AxisPro » dans les textes.

Co-Authored-By: Claude Opus 5.5 <noreply@anthropic.com>
</commit_message>
<xml_diff>
--- a/docs/projet/Questionnaire_parametrage_finance.docx
+++ b/docs/projet/Questionnaire_parametrage_finance.docx
@@ -74,7 +74,7 @@
           <w:sz w:val="20"/>
           <w:szCs w:val="20"/>
         </w:rPr>
-        <w:t xml:space="preserve">Finance et comptabilité d'EGUITRA GROUP SARLU et de MB AxisPro Consulting. Les réponses fixent le réglage de la plateforme NIMOVA et la reprise du classeur 2026 ; les premiers thèmes sont les plus urgents. Une phrase par réponse suffit, de préférence dans le classeur « Questionnaire_parametrage_finance.xlsx ».</w:t>
+        <w:t xml:space="preserve">Finance et comptabilité d'EGUITRA GROUP SARLU et de MB AxisPro. Les réponses fixent le réglage de la plateforme NIMOVA et la reprise du classeur 2026 ; les premiers thèmes sont les plus urgents. Une phrase par réponse suffit, de préférence dans le classeur « Questionnaire_parametrage_finance.xlsx ».</w:t>
       </w:r>
     </w:p>
     <w:p>
@@ -152,7 +152,7 @@
           <w:sz w:val="20"/>
           <w:szCs w:val="20"/>
         </w:rPr>
-        <w:t xml:space="preserve">MB AxisPro Consulting a-t-elle son propre classeur, ou ses opérations sont-elles dans celui d'EGUITRA GROUP ? (DAF)</w:t>
+        <w:t xml:space="preserve">MB AxisPro a-t-elle son propre classeur, ou ses opérations sont-elles dans celui d'EGUITRA GROUP ? (DAF)</w:t>
       </w:r>
     </w:p>
     <w:p>
@@ -395,7 +395,7 @@
           <w:sz w:val="20"/>
           <w:szCs w:val="20"/>
         </w:rPr>
-        <w:t xml:space="preserve">Quel est le régime fiscal de chaque société, et les deux sont-elles assujetties à la TVA ? Quand a commencé le premier exercice de MB AxisPro Consulting ? (DAF)</w:t>
+        <w:t xml:space="preserve">Quel est le régime fiscal de chaque société, et les deux sont-elles assujetties à la TVA ? Quand a commencé le premier exercice de MB AxisPro ? (DAF)</w:t>
       </w:r>
     </w:p>
     <w:p>

</xml_diff>